<commit_message>
Really small fixes and now resubmitted
</commit_message>
<xml_diff>
--- a/manuscript/Manuscript_v3_revised.docx
+++ b/manuscript/Manuscript_v3_revised.docx
@@ -800,7 +800,13 @@
         <w:t>Hiroa, 1921; Kusabs &amp; Quinn, 2009</w:t>
       </w:r>
       <w:r>
-        <w:t xml:space="preserve">). However, kōura populations are increasingly threatened by climate change, invasive species and declining water quality (Kusabs et al., 2015a; Lee et al., 2025). These declines are likely the result of multiple interacting environmental stressors, including declining water quality, deoxygenation and the introduction and consequent impacts of non-native species (Kusabs &amp; Quinn, 2009). For example, in Lakes Rotorua and Rotoiti, located in the Bay of Plenty region of Aotearoa’s North Island, kōura populations have declined by 76% and 91 %, respectively, over the past two decades (Kusabs et al., 2026). </w:t>
+        <w:t>). However, kōura populations are increasingly threatened by climate change, invasive species and declining water quality (Kusabs et al., 2015a; Lee et al., 2025). These declines are likely the result of multiple interacting environmental stressors, including declining water quality, deoxygenation and the introduction and consequent impacts of non-native species (Kusabs &amp; Quinn, 2009). For example, in Lakes Rotorua and Rotoiti, located in the Bay of Plenty region of Aotearoa’s North Island, kōura populations have declined by 76</w:t>
+      </w:r>
+      <w:r>
+        <w:t xml:space="preserve"> </w:t>
+      </w:r>
+      <w:r>
+        <w:t xml:space="preserve">% and 91 %, respectively, over the past two decades (Kusabs et al., 2026). </w:t>
       </w:r>
     </w:p>
     <w:p>
@@ -1112,25 +1118,7 @@
         </w:rPr>
       </w:pPr>
       <w:r>
-        <w:t>Declines in kōura populations have cascading ecological impacts and implications for Māori cultural practices, including reduced opportunities for customary harvest and disruption of traditional activities (Kusabs &amp; Quinn, 2009; Kusabs et al., 2015a</w:t>
-      </w:r>
-      <w:r>
-        <w:t>, Kusabs et al., 2026</w:t>
-      </w:r>
-      <w:r>
-        <w:t xml:space="preserve">). To effectively conserve and restore populations requires an improved understanding of where kōura occur within lakes and what habitats are most important for sustaining healthy populations. Previous research in stream environments has shown that kōura preferentially occupy </w:t>
-      </w:r>
-      <w:r>
-        <w:t xml:space="preserve">structurally complex </w:t>
-      </w:r>
-      <w:r>
-        <w:t xml:space="preserve">habitats </w:t>
-      </w:r>
-      <w:r>
-        <w:t>characterised by</w:t>
-      </w:r>
-      <w:r>
-        <w:t xml:space="preserve"> bank undercuts, woody debris, leaf litter, boulders and low flow velocities (</w:t>
+        <w:t>Declines in kōura populations have cascading ecological impacts and implications for Māori cultural practices, including reduced opportunities for customary harvest and disruption of traditional activities (Kusabs &amp; Quinn, 2009; Kusabs et al., 2015a, Kusabs et al., 2026). To effectively conserve and restore populations requires an improved understanding of where kōura occur within lakes and what habitats are most important for sustaining healthy populations. Previous research in stream environments has shown that kōura preferentially occupy structurally complex habitats characterised by bank undercuts, woody debris, leaf litter, boulders and low flow velocities (</w:t>
       </w:r>
       <w:r>
         <w:rPr>
@@ -1139,16 +1127,7 @@
         <w:t>Usio &amp; Townsend, 2000; Parkyn &amp; Collier, 2004; Jowett et al., 2008; Parkyn et al., 2009</w:t>
       </w:r>
       <w:r>
-        <w:t>). In contrast, habitats used by kōura in lakes remains poorly understood, with previous studies largely focused on deeper offshore habitats (Devcich, 1979; Kusabs &amp; Quinn, 2009; Kusabs et al., 2015b). These studies suggest that benthic substrate characteristics may be more important than nutrient enrichment or predator abundance—specifically</w:t>
-      </w:r>
-      <w:r>
-        <w:t xml:space="preserve"> non-native </w:t>
-      </w:r>
-      <w:r>
-        <w:t>rainbow trout</w:t>
-      </w:r>
-      <w:r>
-        <w:t xml:space="preserve"> (</w:t>
+        <w:t>). In contrast, habitats used by kōura in lakes remains poorly understood, with previous studies largely focused on deeper offshore habitats (Devcich, 1979; Kusabs &amp; Quinn, 2009; Kusabs et al., 2015b). These studies suggest that benthic substrate characteristics may be more important than nutrient enrichment or predator abundance—specifically non-native rainbow trout (</w:t>
       </w:r>
       <w:r>
         <w:rPr>
@@ -1158,10 +1137,7 @@
         <w:t>Oncorhynchus mykiss</w:t>
       </w:r>
       <w:r>
-        <w:t xml:space="preserve"> Walbaum, 1792) </w:t>
-      </w:r>
-      <w:r>
-        <w:t>—in determining kōura distribution (Kusabs et al., 2015b). The littoral zone of lakes has received little attention, despite it being the most productive zone and supporting key life history processes of kōura (Strayer &amp; Findlay, 2010), including nocturnal foraging and use by ovigerous females prior to juvenile release (Devcich, 1979). Consequently, the littoral zone is likely to represent an important habitat within lakes for kōura.</w:t>
+        <w:t xml:space="preserve"> Walbaum, 1792) —in determining kōura distribution (Kusabs et al., 2015b). The littoral zone of lakes has received little attention, despite it being the most productive zone and supporting key life history processes of kōura (Strayer &amp; Findlay, 2010), including nocturnal foraging and use by ovigerous females prior to juvenile release (Devcich, 1979). Consequently, the littoral zone is likely to represent an important habitat within lakes for kōura.</w:t>
       </w:r>
     </w:p>
     <w:p>
@@ -1392,10 +1368,7 @@
         <w:jc w:val="left"/>
       </w:pPr>
       <w:r>
-        <w:t xml:space="preserve">Study sites were selected in five lakes located in the Rotorua Te Arawa Lakes area in the North Island of Aotearoa. The Lakes Rotorua, Rotoiti, Rotoehu, Rotomā, and Ōkāreka are </w:t>
-      </w:r>
-      <w:r>
-        <w:t>located on a warm- temperate volcanic plateau (280-355 m) where winters are mild</w:t>
+        <w:t>Study sites were selected in five lakes located in the Rotorua Te Arawa Lakes area in the North Island of Aotearoa. The Lakes Rotorua, Rotoiti, Rotoehu, Rotomā, and Ōkāreka are located on a warm- temperate volcanic plateau (280-355 m) where winters are mild</w:t>
       </w:r>
       <w:r>
         <w:t xml:space="preserve"> </w:t>
@@ -1410,43 +1383,10 @@
         <w:t>The lakes span a wide range of morphometric and trophic conditions from shallow polymictic eutrophic systems (Rotoehu, maximum depth 14 m) to deep stratified oligotrophic lakes (Rotomā, maximum depth 83 m). Shorelines are characterised by a mix of native riparian vegetation, exotic pasture, and low-density residential development, with several lakes also supporting stands of emergent macrophytes. Detailed lake characteristics and shoreline composition are summarised in Table 1.</w:t>
       </w:r>
       <w:r>
-        <w:t>All five lakes have populations of kōura</w:t>
-      </w:r>
-      <w:r>
-        <w:t>, and</w:t>
-      </w:r>
-      <w:r>
-        <w:t xml:space="preserve"> brown bullhead catfish </w:t>
-      </w:r>
-      <w:r>
-        <w:t xml:space="preserve">was present </w:t>
-      </w:r>
-      <w:r>
-        <w:t>in Lake</w:t>
-      </w:r>
-      <w:r>
-        <w:t>s</w:t>
-      </w:r>
-      <w:r>
         <w:t xml:space="preserve"> </w:t>
       </w:r>
       <w:r>
-        <w:t xml:space="preserve">Rotorua and </w:t>
-      </w:r>
-      <w:r>
-        <w:t xml:space="preserve">Rotoiti </w:t>
-      </w:r>
-      <w:r>
-        <w:t xml:space="preserve">at time of sampling </w:t>
-      </w:r>
-      <w:r>
-        <w:t>(</w:t>
-      </w:r>
-      <w:r>
-        <w:t>Kusabs et al., 2026</w:t>
-      </w:r>
-      <w:r>
-        <w:t>).</w:t>
+        <w:t>All five lakes have populations of kōura, and brown bullhead catfish was present in Lakes Rotorua and Rotoiti at time of sampling (Kusabs et al., 2026).</w:t>
       </w:r>
     </w:p>
     <w:p>
@@ -2291,7 +2231,13 @@
       </w:r>
       <w:r>
         <w:lastRenderedPageBreak/>
-        <w:t xml:space="preserve">intervals, with box traps positioned between them. All equipment was deployed simultaneously at each site for a 24-h period. The use of two fyke nets and two baited </w:t>
+        <w:t xml:space="preserve">intervals, with </w:t>
+      </w:r>
+      <w:r>
+        <w:t xml:space="preserve">bait </w:t>
+      </w:r>
+      <w:r>
+        <w:t xml:space="preserve">traps positioned between them. All equipment was deployed simultaneously at each site for a 24-h period. The use of two fyke nets and two baited </w:t>
       </w:r>
       <w:r>
         <w:t xml:space="preserve">bait </w:t>
@@ -2709,7 +2655,7 @@
         <w:t xml:space="preserve"> </w:t>
       </w:r>
       <w:r>
-        <w:t>implemented with the mgcv package in R (Wood, 2004</w:t>
+        <w:t>implemented with the mgcv package (Wood, 2004</w:t>
       </w:r>
       <w:r>
         <w:t>,</w:t>
@@ -2727,11 +2673,11 @@
         <w:t xml:space="preserve"> </w:t>
       </w:r>
       <w:r>
-        <w:t xml:space="preserve">To reduce multicollinearity, predictors were screened using Variance Inflation Factors (VIFs) calculated from </w:t>
+        <w:t xml:space="preserve">To reduce multicollinearity, predictors were screened using Variance Inflation Factors (VIFs) calculated from linear models fitted </w:t>
       </w:r>
       <w:r>
         <w:lastRenderedPageBreak/>
-        <w:t>linear models fitted to the fixed-effect design matrix. A conservative threshold of VIF &gt; 5 was applied (Quinn &amp; Keough, 2002; Kutner</w:t>
+        <w:t>to the fixed-effect design matrix. A conservative threshold of VIF &gt; 5 was applied (Quinn &amp; Keough, 2002; Kutner</w:t>
       </w:r>
       <w:r>
         <w:t xml:space="preserve"> et al.</w:t>
@@ -2897,7 +2843,7 @@
         <w:t xml:space="preserve"> </w:t>
       </w:r>
       <w:r>
-        <w:t>Lake identity (LID) was included as a random effect in all GAMMs to account for spatial clustering and non-independence among observations and was not subject to the variable selection procedure</w:t>
+        <w:t>Lake identity was included as a random effect in all GAMMs to account for spatial clustering and non-independence among observations and was not subject to the variable selection procedure</w:t>
       </w:r>
       <w:r>
         <w:t xml:space="preserve"> (Zuur et al</w:t>
@@ -4484,7 +4430,19 @@
         <w:rPr>
           <w:rFonts w:cstheme="minorHAnsi"/>
         </w:rPr>
-        <w:t xml:space="preserve">s the full model is overfitting the data </w:t>
+        <w:t xml:space="preserve">s the full model </w:t>
+      </w:r>
+      <w:r>
+        <w:rPr>
+          <w:rFonts w:cstheme="minorHAnsi"/>
+        </w:rPr>
+        <w:t>was</w:t>
+      </w:r>
+      <w:r>
+        <w:rPr>
+          <w:rFonts w:cstheme="minorHAnsi"/>
+        </w:rPr>
+        <w:t xml:space="preserve"> overfitting the data </w:t>
       </w:r>
       <w:r>
         <w:t>the reduced model was chosen for inference.</w:t>
@@ -5479,7 +5437,13 @@
         <w:t xml:space="preserve"> </w:t>
       </w:r>
       <w:r>
-        <w:t>That a consistent negative effect was nonetheless detected across both CPUE and BPUE models suggests the relationship is ecologically meaningful despite the limited representation of this habitat type in the dataset.</w:t>
+        <w:t xml:space="preserve">That a consistent negative effect was nonetheless detected across both CPUE and BPUE models suggests the relationship </w:t>
+      </w:r>
+      <w:r>
+        <w:t>may be</w:t>
+      </w:r>
+      <w:r>
+        <w:t xml:space="preserve"> ecologically meaningful despite the limited representation of this habitat type in the dataset.</w:t>
       </w:r>
     </w:p>
     <w:p>
@@ -5726,13 +5690,7 @@
         <w:jc w:val="left"/>
       </w:pPr>
       <w:r>
-        <w:t xml:space="preserve">Elevated summer water temperatures were negatively associated with kōura abundance in both occupancy and CPUE models, indicating that thermal conditions impose an important constraint on littoral habitat suitability. </w:t>
-      </w:r>
-      <w:r>
-        <w:t xml:space="preserve">Lakes were surveyed at different times across the spring-summer period, so between-lake temperature differences partly reflect when each lake was sampled, not only differences in thermal regime. </w:t>
-      </w:r>
-      <w:r>
-        <w:t>Kōura are known to be temperature-sensitive, with activity increasing above approximately 10 °C and temperatures exceeding 21 °C considered thermally stressful</w:t>
+        <w:t>Elevated summer water temperatures were negatively associated with kōura abundance in both occupancy and CPUE models, indicating that thermal conditions impose an important constraint on littoral habitat suitability. Lakes were surveyed at different times across the spring-summer period, so between-lake temperature differences partly reflect when each lake was sampled, not only differences in thermal regime. Kōura are known to be temperature-sensitive, with activity increasing above approximately 10 °C and temperatures exceeding 21 °C considered thermally stressful</w:t>
       </w:r>
       <w:r>
         <w:t xml:space="preserve">, and probably leading to </w:t>
@@ -6171,19 +6129,7 @@
         <w:jc w:val="left"/>
       </w:pPr>
       <w:r>
-        <w:t>We thank Te Arawa Lakes Trust and Te Komiti Whakahaere for the opportunity to study kōura in the</w:t>
-      </w:r>
-      <w:r>
-        <w:t xml:space="preserve"> Rotorua Te Arawa lakes</w:t>
-      </w:r>
-      <w:r>
-        <w:t xml:space="preserve">. We are grateful to Soweeta Fort-D’ath and William Anaru (Te Arawa Lakes Trust), and Tihini Grant (Ngāti Pikiao), for facilitating access to the lakes and supporting the field programme. We appreciate Joe Butterworth’s assistance with fieldwork, and the support of Andy Bruere and </w:t>
-      </w:r>
-      <w:r>
-        <w:t xml:space="preserve">the </w:t>
-      </w:r>
-      <w:r>
-        <w:t>Bay of Plenty Regional Council in helping to fund the fieldwork. We thank Calum MacNeil and three anonymous reviewers for feedback on an earlier version of this manuscript.</w:t>
+        <w:t>We thank Te Arawa Lakes Trust and Te Komiti Whakahaere for the opportunity to study kōura in the Rotorua Te Arawa lakes. We are grateful to Soweeta Fort-D’ath and William Anaru (Te Arawa Lakes Trust), and Tihini Grant (Ngāti Pikiao), for facilitating access to the lakes and supporting the field programme. We appreciate Joe Butterworth’s assistance with fieldwork, and the support of Andy Bruere and the Bay of Plenty Regional Council in helping to fund the fieldwork. We thank Calum MacNeil and three anonymous reviewers for feedback on an earlier version of this manuscript.</w:t>
       </w:r>
     </w:p>
     <w:p>
@@ -6249,13 +6195,7 @@
         <w:jc w:val="left"/>
       </w:pPr>
       <w:r>
-        <w:t xml:space="preserve">Study conception and design were undertaken by O.V.R., F.J.B., I.A.K.K., R.H., and D.Ö. Fieldwork was conducted by O.V.R. Data analysis was performed by O.V.R., with statistical advice from F.J.B. Local ecological </w:t>
-      </w:r>
-      <w:r>
-        <w:t xml:space="preserve">and traditional </w:t>
-      </w:r>
-      <w:r>
-        <w:t xml:space="preserve">knowledge was contributed by I.A.K.K. and R.H. Manuscript drafting was </w:t>
+        <w:t xml:space="preserve">Study conception and design were undertaken by O.V.R., F.J.B., I.A.K.K., R.H., and D.Ö. Fieldwork was conducted by O.V.R. Data analysis was performed by O.V.R., with statistical advice from F.J.B. Local ecological and traditional knowledge was contributed by I.A.K.K. and R.H. Manuscript drafting was </w:t>
       </w:r>
       <w:r>
         <w:lastRenderedPageBreak/>
@@ -12842,7 +12782,7 @@
                 <w:sz w:val="16"/>
                 <w:szCs w:val="16"/>
               </w:rPr>
-              <w:t>identity (LID)</w:t>
+              <w:t>identity</w:t>
             </w:r>
           </w:p>
         </w:tc>
@@ -55659,6 +55599,7 @@
   <w:style w:type="character" w:default="1" w:styleId="DefaultParagraphFont">
     <w:name w:val="Default Paragraph Font"/>
     <w:uiPriority w:val="1"/>
+    <w:semiHidden/>
     <w:unhideWhenUsed/>
   </w:style>
   <w:style w:type="table" w:default="1" w:styleId="TableNormal">

</xml_diff>

<commit_message>
Update render to make publication ready
</commit_message>
<xml_diff>
--- a/manuscript/Manuscript_v3_revised.docx
+++ b/manuscript/Manuscript_v3_revised.docx
@@ -523,7 +523,7 @@
           <w:b/>
           <w:bCs/>
         </w:rPr>
-        <w:t xml:space="preserve">Key words: </w:t>
+        <w:t xml:space="preserve">Keywords: </w:t>
       </w:r>
       <w:r>
         <w:rPr>
@@ -2307,72 +2307,81 @@
           <w:i/>
           <w:iCs/>
         </w:rPr>
-        <w:t>Retropinna retropinna</w:t>
-      </w:r>
+        <w:t xml:space="preserve">Retropinna </w:t>
+      </w:r>
+      <w:proofErr w:type="spellStart"/>
       <w:r>
         <w:rPr>
           <w:i/>
           <w:iCs/>
         </w:rPr>
-        <w:t xml:space="preserve"> </w:t>
-      </w:r>
-      <w:r>
-        <w:t>(</w:t>
-      </w:r>
-      <w:r>
-        <w:t>Richardson, 1848</w:t>
-      </w:r>
-      <w:r>
-        <w:t>)</w:t>
-      </w:r>
-      <w:r>
-        <w:t>), kōaro (</w:t>
-      </w:r>
+        <w:t>retropinna</w:t>
+      </w:r>
+      <w:proofErr w:type="spellEnd"/>
       <w:r>
         <w:rPr>
           <w:i/>
           <w:iCs/>
         </w:rPr>
-        <w:t>Galaxias brevipinnis</w:t>
+        <w:t xml:space="preserve"> </w:t>
+      </w:r>
+      <w:r>
+        <w:t>(</w:t>
+      </w:r>
+      <w:r>
+        <w:t>Richardson, 1848</w:t>
+      </w:r>
+      <w:r>
+        <w:t>)</w:t>
+      </w:r>
+      <w:r>
+        <w:t>), kōaro (</w:t>
       </w:r>
       <w:r>
         <w:rPr>
           <w:i/>
           <w:iCs/>
         </w:rPr>
-        <w:t xml:space="preserve"> </w:t>
-      </w:r>
-      <w:r>
-        <w:t>Günther, 1866</w:t>
-      </w:r>
-      <w:r>
-        <w:t>), rainbow trout, common bully (</w:t>
+        <w:t>Galaxias brevipinnis</w:t>
       </w:r>
       <w:r>
         <w:rPr>
           <w:i/>
           <w:iCs/>
         </w:rPr>
-        <w:t>Gobiomorphus cotidianus</w:t>
+        <w:t xml:space="preserve"> </w:t>
+      </w:r>
+      <w:r>
+        <w:t>Günther, 1866</w:t>
+      </w:r>
+      <w:r>
+        <w:t>), rainbow trout, common bully (</w:t>
       </w:r>
       <w:r>
         <w:rPr>
           <w:i/>
           <w:iCs/>
         </w:rPr>
-        <w:t xml:space="preserve"> </w:t>
-      </w:r>
-      <w:r>
-        <w:t>McDowall &amp; Fulton, 1978</w:t>
-      </w:r>
-      <w:r>
-        <w:t>), and mosquitofish (</w:t>
+        <w:t>Gobiomorphus cotidianus</w:t>
       </w:r>
       <w:r>
         <w:rPr>
           <w:i/>
           <w:iCs/>
         </w:rPr>
+        <w:t xml:space="preserve"> </w:t>
+      </w:r>
+      <w:r>
+        <w:t>McDowall &amp; Fulton, 1978</w:t>
+      </w:r>
+      <w:r>
+        <w:t>), and mosquitofish (</w:t>
+      </w:r>
+      <w:r>
+        <w:rPr>
+          <w:i/>
+          <w:iCs/>
+        </w:rPr>
         <w:t>Gambusia affinis</w:t>
       </w:r>
       <w:r>
@@ -2478,13 +2487,21 @@
         <w:t>,</w:t>
       </w:r>
       <w:r>
-        <w:t xml:space="preserve"> 2006). Predicted values were back</w:t>
+        <w:t xml:space="preserve"> 2006). Predicted values were </w:t>
+      </w:r>
+      <w:proofErr w:type="gramStart"/>
+      <w:r>
+        <w:t>back</w:t>
       </w:r>
       <w:r>
         <w:t>-</w:t>
       </w:r>
       <w:r>
-        <w:t>transformed with a lognormal bias</w:t>
+        <w:t>transformed</w:t>
+      </w:r>
+      <w:proofErr w:type="gramEnd"/>
+      <w:r>
+        <w:t xml:space="preserve"> with a lognormal bias</w:t>
       </w:r>
       <w:r>
         <w:t xml:space="preserve"> </w:t>
@@ -2794,7 +2811,15 @@
         <w:t xml:space="preserve"> </w:t>
       </w:r>
       <w:r>
-        <w:t xml:space="preserve">were modelled as smooth terms using thin plate regression splines (bs = 'ts'), which apply additional shrinkage to penalise overly complex relationships and can shrink smooth terms fully to zero during selection (Wood, 2017). Basis dimensions (k) were set based on the number of unique values per predictor and adjusted where necessary to balance flexibility and parsimony. </w:t>
+        <w:t>were modelled as smooth terms using thin plate regression splines (bs = '</w:t>
+      </w:r>
+      <w:proofErr w:type="spellStart"/>
+      <w:r>
+        <w:t>ts'</w:t>
+      </w:r>
+      <w:proofErr w:type="spellEnd"/>
+      <w:r>
+        <w:t xml:space="preserve">), which apply additional shrinkage to penalise overly complex relationships and can shrink smooth terms fully to zero during selection (Wood, 2017). Basis dimensions (k) were set based on the number of unique values per predictor and adjusted where necessary to balance flexibility and parsimony. </w:t>
       </w:r>
       <w:r>
         <w:t xml:space="preserve">Binary </w:t>
@@ -6019,7 +6044,23 @@
         <w:t xml:space="preserve"> </w:t>
       </w:r>
       <w:r>
-        <w:t>(Meerhoff &amp; de los Ángeles González-Sagrario, 2022)</w:t>
+        <w:t>(</w:t>
+      </w:r>
+      <w:proofErr w:type="spellStart"/>
+      <w:r>
+        <w:t>Meerhoff</w:t>
+      </w:r>
+      <w:proofErr w:type="spellEnd"/>
+      <w:r>
+        <w:t xml:space="preserve"> &amp; de </w:t>
+      </w:r>
+      <w:proofErr w:type="spellStart"/>
+      <w:r>
+        <w:t>los</w:t>
+      </w:r>
+      <w:proofErr w:type="spellEnd"/>
+      <w:r>
+        <w:t xml:space="preserve"> Ángeles González-Sagrario, 2022)</w:t>
       </w:r>
       <w:r>
         <w:t>.</w:t>
@@ -6923,7 +6964,27 @@
           <w:sz w:val="18"/>
           <w:szCs w:val="18"/>
         </w:rPr>
-        <w:t>The North American Benthological Society</w:t>
+        <w:t xml:space="preserve">The North American </w:t>
+      </w:r>
+      <w:proofErr w:type="spellStart"/>
+      <w:r>
+        <w:rPr>
+          <w:i/>
+          <w:iCs/>
+          <w:sz w:val="18"/>
+          <w:szCs w:val="18"/>
+        </w:rPr>
+        <w:t>Benthological</w:t>
+      </w:r>
+      <w:proofErr w:type="spellEnd"/>
+      <w:r>
+        <w:rPr>
+          <w:i/>
+          <w:iCs/>
+          <w:sz w:val="18"/>
+          <w:szCs w:val="18"/>
+        </w:rPr>
+        <w:t xml:space="preserve"> Society</w:t>
       </w:r>
       <w:r>
         <w:rPr>
@@ -7539,7 +7600,55 @@
           <w:sz w:val="18"/>
           <w:szCs w:val="18"/>
         </w:rPr>
-        <w:t xml:space="preserve">Hesni M.A., Shabanipour N., Zahmatkesh A. &amp; Toutouni M.M. (2009). Effects of Temperature and Salinity on Survival and Moulting of the Narrow-Clawed Crayfish, </w:t>
+        <w:t xml:space="preserve">Hesni M.A., </w:t>
+      </w:r>
+      <w:proofErr w:type="spellStart"/>
+      <w:r>
+        <w:rPr>
+          <w:sz w:val="18"/>
+          <w:szCs w:val="18"/>
+        </w:rPr>
+        <w:t>Shabanipour</w:t>
+      </w:r>
+      <w:proofErr w:type="spellEnd"/>
+      <w:r>
+        <w:rPr>
+          <w:sz w:val="18"/>
+          <w:szCs w:val="18"/>
+        </w:rPr>
+        <w:t xml:space="preserve"> N., </w:t>
+      </w:r>
+      <w:proofErr w:type="spellStart"/>
+      <w:r>
+        <w:rPr>
+          <w:sz w:val="18"/>
+          <w:szCs w:val="18"/>
+        </w:rPr>
+        <w:t>Zahmatkesh</w:t>
+      </w:r>
+      <w:proofErr w:type="spellEnd"/>
+      <w:r>
+        <w:rPr>
+          <w:sz w:val="18"/>
+          <w:szCs w:val="18"/>
+        </w:rPr>
+        <w:t xml:space="preserve"> A. &amp; </w:t>
+      </w:r>
+      <w:proofErr w:type="spellStart"/>
+      <w:r>
+        <w:rPr>
+          <w:sz w:val="18"/>
+          <w:szCs w:val="18"/>
+        </w:rPr>
+        <w:t>Toutouni</w:t>
+      </w:r>
+      <w:proofErr w:type="spellEnd"/>
+      <w:r>
+        <w:rPr>
+          <w:sz w:val="18"/>
+          <w:szCs w:val="18"/>
+        </w:rPr>
+        <w:t xml:space="preserve"> M.M. (2009). Effects of Temperature and Salinity on Survival and Moulting of the Narrow-Clawed Crayfish, </w:t>
       </w:r>
       <w:r>
         <w:rPr>
@@ -7555,8 +7664,25 @@
           <w:sz w:val="18"/>
           <w:szCs w:val="18"/>
         </w:rPr>
-        <w:t xml:space="preserve"> Eschscholtz, 1823 (decapoda, Astacidea). </w:t>
-      </w:r>
+        <w:t xml:space="preserve"> Eschscholtz, 1823 (</w:t>
+      </w:r>
+      <w:proofErr w:type="spellStart"/>
+      <w:r>
+        <w:rPr>
+          <w:sz w:val="18"/>
+          <w:szCs w:val="18"/>
+        </w:rPr>
+        <w:t>decapoda</w:t>
+      </w:r>
+      <w:proofErr w:type="spellEnd"/>
+      <w:r>
+        <w:rPr>
+          <w:sz w:val="18"/>
+          <w:szCs w:val="18"/>
+        </w:rPr>
+        <w:t xml:space="preserve">, Astacidea). </w:t>
+      </w:r>
+      <w:proofErr w:type="spellStart"/>
       <w:r>
         <w:rPr>
           <w:i/>
@@ -7566,6 +7692,7 @@
         </w:rPr>
         <w:t>Crustaceana</w:t>
       </w:r>
+      <w:proofErr w:type="spellEnd"/>
       <w:r>
         <w:rPr>
           <w:sz w:val="18"/>
@@ -7603,7 +7730,23 @@
           <w:sz w:val="18"/>
           <w:szCs w:val="18"/>
         </w:rPr>
-        <w:t xml:space="preserve">Hessen, D. O., Skurdal, J., &amp; Braathen, J. E. (2004). Plant Exclusion of a Herbivore; Crayfish Population Decline caused by an Invading Waterweed. </w:t>
+        <w:t xml:space="preserve">Hessen, D. O., Skurdal, J., &amp; Braathen, J. E. (2004). Plant Exclusion of </w:t>
+      </w:r>
+      <w:proofErr w:type="gramStart"/>
+      <w:r>
+        <w:rPr>
+          <w:sz w:val="18"/>
+          <w:szCs w:val="18"/>
+        </w:rPr>
+        <w:t>a</w:t>
+      </w:r>
+      <w:proofErr w:type="gramEnd"/>
+      <w:r>
+        <w:rPr>
+          <w:sz w:val="18"/>
+          <w:szCs w:val="18"/>
+        </w:rPr>
+        <w:t xml:space="preserve"> Herbivore; Crayfish Population Decline caused by an Invading Waterweed. </w:t>
       </w:r>
       <w:r>
         <w:rPr>
@@ -8145,7 +8288,23 @@
           <w:sz w:val="18"/>
           <w:szCs w:val="18"/>
         </w:rPr>
-        <w:t xml:space="preserve">Kutner, M. H., Nachtsheim, C. J., Neter, J., &amp; Li, W. (2005). </w:t>
+        <w:t xml:space="preserve">Kutner, M. H., Nachtsheim, C. J., </w:t>
+      </w:r>
+      <w:proofErr w:type="spellStart"/>
+      <w:r>
+        <w:rPr>
+          <w:sz w:val="18"/>
+          <w:szCs w:val="18"/>
+        </w:rPr>
+        <w:t>Neter</w:t>
+      </w:r>
+      <w:proofErr w:type="spellEnd"/>
+      <w:r>
+        <w:rPr>
+          <w:sz w:val="18"/>
+          <w:szCs w:val="18"/>
+        </w:rPr>
+        <w:t xml:space="preserve">, J., &amp; Li, W. (2005). </w:t>
       </w:r>
       <w:r>
         <w:rPr>
@@ -8359,7 +8518,23 @@
           <w:sz w:val="18"/>
           <w:szCs w:val="18"/>
         </w:rPr>
-        <w:t xml:space="preserve">Meerhoff, M., &amp; de los Ángeles González-Sagrario, M. (2022). Habitat complexity in shallow lakes and ponds: Importance, threats, and potential for restoration. </w:t>
+        <w:t xml:space="preserve">Meerhoff, M., &amp; de </w:t>
+      </w:r>
+      <w:proofErr w:type="spellStart"/>
+      <w:r>
+        <w:rPr>
+          <w:sz w:val="18"/>
+          <w:szCs w:val="18"/>
+        </w:rPr>
+        <w:t>los</w:t>
+      </w:r>
+      <w:proofErr w:type="spellEnd"/>
+      <w:r>
+        <w:rPr>
+          <w:sz w:val="18"/>
+          <w:szCs w:val="18"/>
+        </w:rPr>
+        <w:t xml:space="preserve"> Ángeles González-Sagrario, M. (2022). Habitat complexity in shallow lakes and ponds: Importance, threats, and potential for restoration. </w:t>
       </w:r>
       <w:r>
         <w:rPr>
@@ -8861,7 +9036,23 @@
           <w:sz w:val="18"/>
           <w:szCs w:val="18"/>
         </w:rPr>
-        <w:t xml:space="preserve">Richman, N. I., Böhm, M., Adams, S. B., Alvarez, F., Bergey, E. A., Bunn, J. J. S., Burnham, Q., Cordeiro, J., Coughran, J., Crandall, K. A., Dawkins, K. L., DiStefano, R. J., Doran, N. E., Edsman, L., Eversole, A. G., Füreder, L., Furse, J. M., Gherardi, F., Hamr, P., … Collen, B. (2015). Multiple drivers of decline in the global status of freshwater crayfish (Decapoda: </w:t>
+        <w:t xml:space="preserve">Richman, N. I., Böhm, M., Adams, S. B., Alvarez, F., Bergey, E. A., Bunn, J. J. S., Burnham, Q., Cordeiro, J., Coughran, J., Crandall, K. A., Dawkins, K. L., DiStefano, R. J., Doran, N. E., </w:t>
+      </w:r>
+      <w:proofErr w:type="spellStart"/>
+      <w:r>
+        <w:rPr>
+          <w:sz w:val="18"/>
+          <w:szCs w:val="18"/>
+        </w:rPr>
+        <w:t>Edsman</w:t>
+      </w:r>
+      <w:proofErr w:type="spellEnd"/>
+      <w:r>
+        <w:rPr>
+          <w:sz w:val="18"/>
+          <w:szCs w:val="18"/>
+        </w:rPr>
+        <w:t xml:space="preserve">, L., Eversole, A. G., Füreder, L., Furse, J. M., Gherardi, F., Hamr, P., … Collen, B. (2015). Multiple drivers of decline in the global status of freshwater crayfish (Decapoda: </w:t>
       </w:r>
       <w:r>
         <w:rPr>
@@ -9001,7 +9192,23 @@
           <w:sz w:val="18"/>
           <w:szCs w:val="18"/>
         </w:rPr>
-        <w:t xml:space="preserve">Rowe, D. K. (1993). Identification of fish responsible for five layers of echoes recorded by high‐frequency (200 kHz) echosounding in Lake Rotoiti, North Island, New Zealand. </w:t>
+        <w:t xml:space="preserve">Rowe, D. K. (1993). Identification of fish responsible for five layers of echoes recorded by </w:t>
+      </w:r>
+      <w:proofErr w:type="gramStart"/>
+      <w:r>
+        <w:rPr>
+          <w:sz w:val="18"/>
+          <w:szCs w:val="18"/>
+        </w:rPr>
+        <w:t>high‐frequency</w:t>
+      </w:r>
+      <w:proofErr w:type="gramEnd"/>
+      <w:r>
+        <w:rPr>
+          <w:sz w:val="18"/>
+          <w:szCs w:val="18"/>
+        </w:rPr>
+        <w:t xml:space="preserve"> (200 kHz) echosounding in Lake Rotoiti, North Island, New Zealand. </w:t>
       </w:r>
       <w:r>
         <w:rPr>
@@ -9672,7 +9879,39 @@
           <w:sz w:val="18"/>
           <w:szCs w:val="18"/>
         </w:rPr>
-        <w:t xml:space="preserve">von Westernhagen, N., Hamilton, D. P., &amp; Pilditch, C. A. (2010). Temporal and spatial variations in phytoplankton productivity in surface waters of a warm-temperate, monomictic lake in New Zealand. </w:t>
+        <w:t xml:space="preserve">von Westernhagen, N., Hamilton, D. P., &amp; </w:t>
+      </w:r>
+      <w:proofErr w:type="spellStart"/>
+      <w:r>
+        <w:rPr>
+          <w:sz w:val="18"/>
+          <w:szCs w:val="18"/>
+        </w:rPr>
+        <w:t>Pilditch</w:t>
+      </w:r>
+      <w:proofErr w:type="spellEnd"/>
+      <w:r>
+        <w:rPr>
+          <w:sz w:val="18"/>
+          <w:szCs w:val="18"/>
+        </w:rPr>
+        <w:t xml:space="preserve">, C. A. (2010). Temporal and spatial variations in phytoplankton productivity in surface waters of a warm-temperate, </w:t>
+      </w:r>
+      <w:proofErr w:type="spellStart"/>
+      <w:r>
+        <w:rPr>
+          <w:sz w:val="18"/>
+          <w:szCs w:val="18"/>
+        </w:rPr>
+        <w:t>monomictic</w:t>
+      </w:r>
+      <w:proofErr w:type="spellEnd"/>
+      <w:r>
+        <w:rPr>
+          <w:sz w:val="18"/>
+          <w:szCs w:val="18"/>
+        </w:rPr>
+        <w:t xml:space="preserve"> lake in New Zealand. </w:t>
       </w:r>
       <w:r>
         <w:rPr>
@@ -9953,7 +10192,23 @@
           <w:sz w:val="18"/>
           <w:szCs w:val="18"/>
         </w:rPr>
-        <w:t xml:space="preserve">Zuur, A. F., Ieno, E. N., Walker, N., Saveliev, A. A., &amp; Smith, G. M. (2009). Mixed effects models and extensions in ecology with R. Springer. </w:t>
+        <w:t xml:space="preserve">Zuur, A. F., </w:t>
+      </w:r>
+      <w:proofErr w:type="spellStart"/>
+      <w:r>
+        <w:rPr>
+          <w:sz w:val="18"/>
+          <w:szCs w:val="18"/>
+        </w:rPr>
+        <w:t>Ieno</w:t>
+      </w:r>
+      <w:proofErr w:type="spellEnd"/>
+      <w:r>
+        <w:rPr>
+          <w:sz w:val="18"/>
+          <w:szCs w:val="18"/>
+        </w:rPr>
+        <w:t xml:space="preserve">, E. N., Walker, N., Saveliev, A. A., &amp; Smith, G. M. (2009). Mixed effects models and extensions in ecology with R. Springer. </w:t>
       </w:r>
       <w:hyperlink r:id="rId37">
         <w:r>
@@ -15809,19 +16064,33 @@
         <w:rPr>
           <w:color w:val="auto"/>
         </w:rPr>
-        <w:t>Length–weight relationship used to estimate missing kōura weights. Observed (measured) and model-predicted body weights are shown in relation to orbital carapace length (OCL). The log₁₀–log₁₀ regression was fitted to individuals with both length and weight measurements (n = 240) and used to estimate missing weights (n = 81). Predicted values were back</w:t>
-      </w:r>
+        <w:t xml:space="preserve">Length–weight relationship used to estimate missing kōura weights. Observed (measured) and model-predicted body weights are shown in relation to orbital carapace length (OCL). The log₁₀–log₁₀ regression was fitted to individuals with both length and weight measurements (n = 240) and used to estimate missing weights (n = 81). Predicted values were </w:t>
+      </w:r>
+      <w:proofErr w:type="gramStart"/>
       <w:r>
         <w:rPr>
           <w:color w:val="auto"/>
         </w:rPr>
+        <w:t>back</w:t>
+      </w:r>
+      <w:r>
+        <w:rPr>
+          <w:color w:val="auto"/>
+        </w:rPr>
         <w:t>-</w:t>
       </w:r>
       <w:r>
         <w:rPr>
           <w:color w:val="auto"/>
         </w:rPr>
-        <w:t>transformed using a lognormal bias correction factor. The fitted regression equation is shown on the plot.</w:t>
+        <w:t>transformed</w:t>
+      </w:r>
+      <w:proofErr w:type="gramEnd"/>
+      <w:r>
+        <w:rPr>
+          <w:color w:val="auto"/>
+        </w:rPr>
+        <w:t xml:space="preserve"> using a lognormal bias correction factor. The fitted regression equation is shown on the plot.</w:t>
       </w:r>
     </w:p>
     <w:p>

</xml_diff>